<commit_message>
Scrum: sprints alineados con el historial real, reuniones en plantillas del docente, MET-01 v1.1 y nombres de archivos
</commit_message>
<xml_diff>
--- a/Fase 2/Evidencias Proyecto/Evidencias de documentación/2. Metodología Scrum/SITRAFO_MET-01_Metodologia_Scrum.docx
+++ b/Fase 2/Evidencias Proyecto/Evidencias de documentación/2. Metodología Scrum/SITRAFO_MET-01_Metodologia_Scrum.docx
@@ -94,7 +94,7 @@
           <w:sz w:val="26"/>
           <w:szCs w:val="26"/>
         </w:rPr>
-        <w:t xml:space="preserve">MET-01  ·  Versión 1.0</w:t>
+        <w:t>MET-01  ·  Versión 1.1</w:t>
       </w:r>
     </w:p>
     <w:tbl>
@@ -740,7 +740,7 @@
                 <w:sz w:val="20"/>
                 <w:szCs w:val="20"/>
               </w:rPr>
-              <w:t xml:space="preserve">8 de octubre de 2026</w:t>
+              <w:t>14 de octubre de 2026</w:t>
             </w:r>
           </w:p>
         </w:tc>
@@ -5879,7 +5879,7 @@
         <w:jc w:val="both"/>
       </w:pPr>
       <w:r>
-        <w:t xml:space="preserve">Es el registro de las tareas que el equipo desarrolla en cada iteración. En la Fase 1 se elaboraron dos pilas de sprint:</w:t>
+        <w:t>Es el registro de las tareas que el equipo desarrolla en cada iteración. En la Fase 1 se elaboraron las pilas del Sprint 0 y del Sprint 1 (plan original). En la Fase 2 se registraron las pilas de los Sprints 1 y 2 según lo efectivamente realizado, y la propuesta del Sprint 3:</w:t>
       </w:r>
     </w:p>
     <w:tbl>
@@ -6052,7 +6052,7 @@
                 <w:sz w:val="18"/>
                 <w:szCs w:val="18"/>
               </w:rPr>
-              <w:t xml:space="preserve">6 tareas de preparación: documentar la arquitectura y la matriz de permisos, configurar el repositorio y el proyecto Django, configurar el entorno con Docker y PostgreSQL, configurar la integración continua, definir la Definición de Terminado y redactar el backlog con criterios de aceptación.</w:t>
+              <w:t>10 tareas: requerimientos, casos de uso, modelo de datos y arquitectura (T-01 a T-04, completadas) y preparación técnica: matriz de permisos, repositorio, entorno Docker, integración continua, Definición de Terminado y backlog con criterios de aceptación (T-05 a T-10, traspasadas).</w:t>
             </w:r>
           </w:p>
         </w:tc>
@@ -6081,7 +6081,7 @@
                 <w:sz w:val="18"/>
                 <w:szCs w:val="18"/>
               </w:rPr>
-              <w:t xml:space="preserve">42 horas</w:t>
+              <w:t>104 horas (29 pendientes al cierre)</w:t>
             </w:r>
           </w:p>
         </w:tc>
@@ -6144,7 +6144,7 @@
                 <w:sz w:val="18"/>
                 <w:szCs w:val="18"/>
               </w:rPr>
-              <w:t xml:space="preserve">15 tareas para las historias de catálogo, registro, solicitud de presupuesto, cotización, aceptación y auditoría.</w:t>
+              <w:t>Plan original: 15 tareas (74 h) para 6 historias. Ejecución real: 42 tareas para las 14 historias y los saldos del Sprint 0, integradas al repositorio el 25 y 26 de septiembre.</w:t>
             </w:r>
           </w:p>
         </w:tc>
@@ -6173,7 +6173,191 @@
                 <w:sz w:val="18"/>
                 <w:szCs w:val="18"/>
               </w:rPr>
-              <w:t xml:space="preserve">74 horas</w:t>
+              <w:t>221 horas</w:t>
+            </w:r>
+          </w:p>
+        </w:tc>
+      </w:tr>
+      <w:tr>
+        <w:trPr>
+          <w:cantSplit/>
+        </w:trPr>
+        <w:tc>
+          <w:tcPr>
+            <w:tcW w:type="dxa" w:w="1300"/>
+            <w:tcBorders>
+              <w:top w:val="single" w:color="8496B0" w:sz="4"/>
+              <w:left w:val="single" w:color="8496B0" w:sz="4"/>
+              <w:bottom w:val="single" w:color="8496B0" w:sz="4"/>
+              <w:right w:val="single" w:color="8496B0" w:sz="4"/>
+            </w:tcBorders>
+            <w:tcMar>
+              <w:top w:type="dxa" w:w="50"/>
+              <w:left w:type="dxa" w:w="90"/>
+              <w:bottom w:type="dxa" w:w="50"/>
+              <w:right w:type="dxa" w:w="90"/>
+            </w:tcMar>
+          </w:tcPr>
+          <w:p>
+            <w:r>
+              <w:rPr>
+                <w:rFonts w:ascii="Calibri" w:cs="Calibri" w:eastAsia="Calibri" w:hAnsi="Calibri"/>
+                <w:b w:val="false"/>
+                <w:bCs w:val="false"/>
+                <w:sz w:val="18"/>
+                <w:szCs w:val="18"/>
+              </w:rPr>
+              <w:t>Sprint 2</w:t>
+            </w:r>
+          </w:p>
+        </w:tc>
+        <w:tc>
+          <w:tcPr>
+            <w:tcW w:type="dxa" w:w="6260"/>
+            <w:tcBorders>
+              <w:top w:val="single" w:color="8496B0" w:sz="4"/>
+              <w:left w:val="single" w:color="8496B0" w:sz="4"/>
+              <w:bottom w:val="single" w:color="8496B0" w:sz="4"/>
+              <w:right w:val="single" w:color="8496B0" w:sz="4"/>
+            </w:tcBorders>
+            <w:tcMar>
+              <w:top w:type="dxa" w:w="50"/>
+              <w:left w:type="dxa" w:w="90"/>
+              <w:bottom w:type="dxa" w:w="50"/>
+              <w:right w:type="dxa" w:w="90"/>
+            </w:tcMar>
+          </w:tcPr>
+          <w:p>
+            <w:r>
+              <w:rPr>
+                <w:rFonts w:ascii="Calibri" w:cs="Calibri" w:eastAsia="Calibri" w:hAnsi="Calibri"/>
+                <w:b w:val="false"/>
+                <w:bCs w:val="false"/>
+                <w:sz w:val="18"/>
+                <w:szCs w:val="18"/>
+              </w:rPr>
+              <w:t>26 tareas: despliegue en Render, completitud de la ERS, documentación de análisis y diseño, artefactos Scrum, manual de usuario, OWASP ZAP, prueba de carga y pruebas con Selenium (29 sep al 15 oct).</w:t>
+            </w:r>
+          </w:p>
+        </w:tc>
+        <w:tc>
+          <w:tcPr>
+            <w:tcW w:type="dxa" w:w="1800"/>
+            <w:tcBorders>
+              <w:top w:val="single" w:color="8496B0" w:sz="4"/>
+              <w:left w:val="single" w:color="8496B0" w:sz="4"/>
+              <w:bottom w:val="single" w:color="8496B0" w:sz="4"/>
+              <w:right w:val="single" w:color="8496B0" w:sz="4"/>
+            </w:tcBorders>
+            <w:tcMar>
+              <w:top w:type="dxa" w:w="50"/>
+              <w:left w:type="dxa" w:w="90"/>
+              <w:bottom w:type="dxa" w:w="50"/>
+              <w:right w:type="dxa" w:w="90"/>
+            </w:tcMar>
+          </w:tcPr>
+          <w:p>
+            <w:r>
+              <w:rPr>
+                <w:rFonts w:ascii="Calibri" w:cs="Calibri" w:eastAsia="Calibri" w:hAnsi="Calibri"/>
+                <w:b w:val="false"/>
+                <w:bCs w:val="false"/>
+                <w:sz w:val="18"/>
+                <w:szCs w:val="18"/>
+              </w:rPr>
+              <w:t>159 horas</w:t>
+            </w:r>
+          </w:p>
+        </w:tc>
+      </w:tr>
+      <w:tr>
+        <w:trPr>
+          <w:cantSplit/>
+        </w:trPr>
+        <w:tc>
+          <w:tcPr>
+            <w:tcW w:type="dxa" w:w="1300"/>
+            <w:tcBorders>
+              <w:top w:val="single" w:color="8496B0" w:sz="4"/>
+              <w:left w:val="single" w:color="8496B0" w:sz="4"/>
+              <w:bottom w:val="single" w:color="8496B0" w:sz="4"/>
+              <w:right w:val="single" w:color="8496B0" w:sz="4"/>
+            </w:tcBorders>
+            <w:tcMar>
+              <w:top w:type="dxa" w:w="50"/>
+              <w:left w:type="dxa" w:w="90"/>
+              <w:bottom w:type="dxa" w:w="50"/>
+              <w:right w:type="dxa" w:w="90"/>
+            </w:tcMar>
+          </w:tcPr>
+          <w:p>
+            <w:r>
+              <w:rPr>
+                <w:rFonts w:ascii="Calibri" w:cs="Calibri" w:eastAsia="Calibri" w:hAnsi="Calibri"/>
+                <w:b w:val="false"/>
+                <w:bCs w:val="false"/>
+                <w:sz w:val="18"/>
+                <w:szCs w:val="18"/>
+              </w:rPr>
+              <w:t>Sprint 3</w:t>
+            </w:r>
+          </w:p>
+        </w:tc>
+        <w:tc>
+          <w:tcPr>
+            <w:tcW w:type="dxa" w:w="6260"/>
+            <w:tcBorders>
+              <w:top w:val="single" w:color="8496B0" w:sz="4"/>
+              <w:left w:val="single" w:color="8496B0" w:sz="4"/>
+              <w:bottom w:val="single" w:color="8496B0" w:sz="4"/>
+              <w:right w:val="single" w:color="8496B0" w:sz="4"/>
+            </w:tcBorders>
+            <w:tcMar>
+              <w:top w:type="dxa" w:w="50"/>
+              <w:left w:type="dxa" w:w="90"/>
+              <w:bottom w:type="dxa" w:w="50"/>
+              <w:right w:type="dxa" w:w="90"/>
+            </w:tcMar>
+          </w:tcPr>
+          <w:p>
+            <w:r>
+              <w:rPr>
+                <w:rFonts w:ascii="Calibri" w:cs="Calibri" w:eastAsia="Calibri" w:hAnsi="Calibri"/>
+                <w:b w:val="false"/>
+                <w:bCs w:val="false"/>
+                <w:sz w:val="18"/>
+                <w:szCs w:val="18"/>
+              </w:rPr>
+              <w:t>Propuesta de 12 tareas para el sprint de cierre: PRU-01, plan de pruebas, rendimiento, visión del producto, manual técnico e informe final.</w:t>
+            </w:r>
+          </w:p>
+        </w:tc>
+        <w:tc>
+          <w:tcPr>
+            <w:tcW w:type="dxa" w:w="1800"/>
+            <w:tcBorders>
+              <w:top w:val="single" w:color="8496B0" w:sz="4"/>
+              <w:left w:val="single" w:color="8496B0" w:sz="4"/>
+              <w:bottom w:val="single" w:color="8496B0" w:sz="4"/>
+              <w:right w:val="single" w:color="8496B0" w:sz="4"/>
+            </w:tcBorders>
+            <w:tcMar>
+              <w:top w:type="dxa" w:w="50"/>
+              <w:left w:type="dxa" w:w="90"/>
+              <w:bottom w:type="dxa" w:w="50"/>
+              <w:right w:type="dxa" w:w="90"/>
+            </w:tcMar>
+          </w:tcPr>
+          <w:p>
+            <w:r>
+              <w:rPr>
+                <w:rFonts w:ascii="Calibri" w:cs="Calibri" w:eastAsia="Calibri" w:hAnsi="Calibri"/>
+                <w:b w:val="false"/>
+                <w:bCs w:val="false"/>
+                <w:sz w:val="18"/>
+                <w:szCs w:val="18"/>
+              </w:rPr>
+              <w:t>59 horas</w:t>
             </w:r>
           </w:p>
         </w:tc>
@@ -7058,7 +7242,7 @@
         <w:jc w:val="both"/>
       </w:pPr>
       <w:r>
-        <w:t xml:space="preserve">Representa las horas o puntos pendientes del sprint en curso, día a día. En la Fase 1 se elaboró el Burn Down del Sprint 0 con la plantilla de 10 días, sobre las 42 horas estimadas de sus 6 tareas. Para los sprints siguientes se elaborará con la plantilla correspondiente a la duración del sprint (5, 10 o 20 días), actualizada por el Scrum Master con las horas consumidas informadas en la reunión diaria.</w:t>
+        <w:t>Representa las horas o puntos pendientes del sprint en curso, día a día. En la Fase 1 se elaboró el Burn Down del Sprint 0 con la plantilla de 10 días, sobre las 104 horas estimadas de sus 10 tareas; cerró con 29 horas pendientes, que se traspasaron al Sprint 1. En la Fase 2 se registraron los Burn Down de los Sprints 1 y 2, reconstruidos desde el historial del repositorio (sección 5). Para los sprints siguientes se elaborará con la plantilla correspondiente a la duración del sprint (5, 10 o 20 días), actualizada por el Scrum Master con las horas consumidas informadas en la reunión diaria.</w:t>
       </w:r>
     </w:p>
     <w:p>
@@ -7420,7 +7604,7 @@
                 <w:sz w:val="18"/>
                 <w:szCs w:val="18"/>
               </w:rPr>
-              <w:t xml:space="preserve">Pilas de sprint con 42 y 74 horas estimadas, y Burn Down del Sprint 0.</w:t>
+              <w:t>Pilas de sprint con 104 y 74 horas estimadas, y Burn Down del Sprint 0.</w:t>
             </w:r>
           </w:p>
         </w:tc>
@@ -7673,6 +7857,132 @@
                 <w:szCs w:val="18"/>
               </w:rPr>
               <w:t xml:space="preserve">Sistema desplegado en https://sitrafo.onrender.com y aplicación de escritorio publicada como SITRAFO.exe.</w:t>
+            </w:r>
+          </w:p>
+        </w:tc>
+      </w:tr>
+      <w:tr>
+        <w:trPr>
+          <w:cantSplit/>
+        </w:trPr>
+        <w:tc>
+          <w:tcPr>
+            <w:tcW w:type="dxa" w:w="3300"/>
+            <w:tcBorders>
+              <w:top w:val="single" w:color="8496B0" w:sz="4"/>
+              <w:left w:val="single" w:color="8496B0" w:sz="4"/>
+              <w:bottom w:val="single" w:color="8496B0" w:sz="4"/>
+              <w:right w:val="single" w:color="8496B0" w:sz="4"/>
+            </w:tcBorders>
+            <w:tcMar>
+              <w:top w:type="dxa" w:w="50"/>
+              <w:left w:type="dxa" w:w="90"/>
+              <w:bottom w:type="dxa" w:w="50"/>
+              <w:right w:type="dxa" w:w="90"/>
+            </w:tcMar>
+          </w:tcPr>
+          <w:p>
+            <w:r>
+              <w:rPr>
+                <w:rFonts w:ascii="Calibri" w:cs="Calibri" w:eastAsia="Calibri" w:hAnsi="Calibri"/>
+                <w:b w:val="false"/>
+                <w:bCs w:val="false"/>
+                <w:sz w:val="18"/>
+                <w:szCs w:val="18"/>
+              </w:rPr>
+              <w:t>Revisión y retrospectiva del Sprint 1</w:t>
+            </w:r>
+          </w:p>
+        </w:tc>
+        <w:tc>
+          <w:tcPr>
+            <w:tcW w:type="dxa" w:w="6060"/>
+            <w:tcBorders>
+              <w:top w:val="single" w:color="8496B0" w:sz="4"/>
+              <w:left w:val="single" w:color="8496B0" w:sz="4"/>
+              <w:bottom w:val="single" w:color="8496B0" w:sz="4"/>
+              <w:right w:val="single" w:color="8496B0" w:sz="4"/>
+            </w:tcBorders>
+            <w:tcMar>
+              <w:top w:type="dxa" w:w="50"/>
+              <w:left w:type="dxa" w:w="90"/>
+              <w:bottom w:type="dxa" w:w="50"/>
+              <w:right w:type="dxa" w:w="90"/>
+            </w:tcMar>
+          </w:tcPr>
+          <w:p>
+            <w:r>
+              <w:rPr>
+                <w:rFonts w:ascii="Calibri" w:cs="Calibri" w:eastAsia="Calibri" w:hAnsi="Calibri"/>
+                <w:b w:val="false"/>
+                <w:bCs w:val="false"/>
+                <w:sz w:val="18"/>
+                <w:szCs w:val="18"/>
+              </w:rPr>
+              <w:t>Reunión en línea del 29 de septiembre, registrada en la plantilla de resumen de reunión retrospectiva.</w:t>
+            </w:r>
+          </w:p>
+        </w:tc>
+      </w:tr>
+      <w:tr>
+        <w:trPr>
+          <w:cantSplit/>
+        </w:trPr>
+        <w:tc>
+          <w:tcPr>
+            <w:tcW w:type="dxa" w:w="3300"/>
+            <w:tcBorders>
+              <w:top w:val="single" w:color="8496B0" w:sz="4"/>
+              <w:left w:val="single" w:color="8496B0" w:sz="4"/>
+              <w:bottom w:val="single" w:color="8496B0" w:sz="4"/>
+              <w:right w:val="single" w:color="8496B0" w:sz="4"/>
+            </w:tcBorders>
+            <w:tcMar>
+              <w:top w:type="dxa" w:w="50"/>
+              <w:left w:type="dxa" w:w="90"/>
+              <w:bottom w:type="dxa" w:w="50"/>
+              <w:right w:type="dxa" w:w="90"/>
+            </w:tcMar>
+          </w:tcPr>
+          <w:p>
+            <w:r>
+              <w:rPr>
+                <w:rFonts w:ascii="Calibri" w:cs="Calibri" w:eastAsia="Calibri" w:hAnsi="Calibri"/>
+                <w:b w:val="false"/>
+                <w:bCs w:val="false"/>
+                <w:sz w:val="18"/>
+                <w:szCs w:val="18"/>
+              </w:rPr>
+              <w:t>Seguimiento del Sprint 2</w:t>
+            </w:r>
+          </w:p>
+        </w:tc>
+        <w:tc>
+          <w:tcPr>
+            <w:tcW w:type="dxa" w:w="6060"/>
+            <w:tcBorders>
+              <w:top w:val="single" w:color="8496B0" w:sz="4"/>
+              <w:left w:val="single" w:color="8496B0" w:sz="4"/>
+              <w:bottom w:val="single" w:color="8496B0" w:sz="4"/>
+              <w:right w:val="single" w:color="8496B0" w:sz="4"/>
+            </w:tcBorders>
+            <w:tcMar>
+              <w:top w:type="dxa" w:w="50"/>
+              <w:left w:type="dxa" w:w="90"/>
+              <w:bottom w:type="dxa" w:w="50"/>
+              <w:right w:type="dxa" w:w="90"/>
+            </w:tcMar>
+          </w:tcPr>
+          <w:p>
+            <w:r>
+              <w:rPr>
+                <w:rFonts w:ascii="Calibri" w:cs="Calibri" w:eastAsia="Calibri" w:hAnsi="Calibri"/>
+                <w:b w:val="false"/>
+                <w:bCs w:val="false"/>
+                <w:sz w:val="18"/>
+                <w:szCs w:val="18"/>
+              </w:rPr>
+              <w:t>Daily y retrospectiva del 13 de octubre por el grupo de WhatsApp del equipo, registrados en las plantillas, y acta de la revisión del 15 de octubre.</w:t>
             </w:r>
           </w:p>
         </w:tc>
@@ -8300,7 +8610,7 @@
         <w:spacing w:after="60"/>
       </w:pPr>
       <w:r>
-        <w:t xml:space="preserve">Reconstrucción de las pilas de sprint y de los gráficos de avance de los Sprints 1 a 3 con lo efectivamente realizado, tomando como fuente el historial del repositorio, sin atribuir fechas ni reuniones que no ocurrieron.</w:t>
+        <w:t>Reconstrucción de las pilas de sprint y de los gráficos de avance con lo efectivamente realizado, tomando como fuente el historial del repositorio y sin atribuir fechas ni reuniones que no ocurrieron: el Sprint 1 corresponde a la iteración de desarrollo de las 14 historias (14 al 26 de septiembre, 221 horas) y el Sprint 2 a despliegue, completitud de la ERS, documentación y verificación de calidad (29 de septiembre al 15 de octubre, 159 horas). La revisión y retrospectiva del Sprint 1 se realizaron en la reunión en línea del 29 de septiembre.</w:t>
       </w:r>
     </w:p>
     <w:p>
@@ -8344,7 +8654,7 @@
         <w:jc w:val="both"/>
       </w:pPr>
       <w:r>
-        <w:t xml:space="preserve">Hasta la entrega final de la Fase 2 el trabajo se organiza como un sprint de cierre, con los siguientes compromisos:</w:t>
+        <w:t>Desde la revisión del Sprint 2 (15 de octubre) hasta la entrega final de la Fase 2, el trabajo se organiza como Sprint 3, sprint de cierre, con los siguientes compromisos:</w:t>
       </w:r>
     </w:p>
     <w:tbl>
@@ -8519,7 +8829,7 @@
                 <w:sz w:val="18"/>
                 <w:szCs w:val="18"/>
               </w:rPr>
-              <w:t xml:space="preserve">Sprint Planning del sprint de cierre</w:t>
+              <w:t>Sprint Planning del Sprint 3</w:t>
             </w:r>
           </w:p>
         </w:tc>
@@ -9107,7 +9417,7 @@
         <w:jc w:val="both"/>
       </w:pPr>
       <w:r>
-        <w:t xml:space="preserve">Objetivo del sprint de cierre: dejar verificada la calidad del producto (análisis de seguridad, prueba de carga y pruebas de interfaz), completar el manual de usuario y la documentación Scrum, y cerrar los informes de la Fase 2.</w:t>
+        <w:t>Objetivo del Sprint 3 (sprint de cierre): completar la verificación en producción (PRU-01), consolidar el plan de pruebas, cumplir el RNF-06 de rendimiento, completar la visión del producto y el manual técnico, y cerrar los informes de la Fase 2.</w:t>
       </w:r>
     </w:p>
     <w:p>

</xml_diff>